<commit_message>
Actualización de Guías de Usuarios Parte 2
Actualización de Guías de Usuarios Parte 2
</commit_message>
<xml_diff>
--- a/PPAFE/16 GUIAS DE USUARIO/Participaciones y Aportaciones Federales y Estatales - Estatales Memorias Calculo.docx
+++ b/PPAFE/16 GUIAS DE USUARIO/Participaciones y Aportaciones Federales y Estatales - Estatales Memorias Calculo.docx
@@ -123,7 +123,7 @@
           <w:lang w:val="es-MX" w:eastAsia="es-MX"/>
         </w:rPr>
         <w:drawing>
-          <wp:anchor distT="0" distB="0" distL="114300" distR="114300" simplePos="0" relativeHeight="251805696" behindDoc="0" locked="0" layoutInCell="1" allowOverlap="1" wp14:anchorId="6F593B06" wp14:editId="100C5F50">
+          <wp:anchor distT="0" distB="0" distL="114300" distR="114300" simplePos="0" relativeHeight="251805696" behindDoc="0" locked="0" layoutInCell="1" allowOverlap="1" wp14:anchorId="6F593B06" wp14:editId="36EAF8E5">
             <wp:simplePos x="0" y="0"/>
             <wp:positionH relativeFrom="margin">
               <wp:posOffset>673617</wp:posOffset>
@@ -1226,7 +1226,7 @@
             </w:rPr>
             <w:fldChar w:fldCharType="separate"/>
           </w:r>
-          <w:hyperlink w:anchor="_Toc199150447" w:history="1">
+          <w:hyperlink w:anchor="_Toc214010209" w:history="1">
             <w:r>
               <w:rPr>
                 <w:rStyle w:val="Hyperlink"/>
@@ -1249,7 +1249,7 @@
               <w:rPr>
                 <w:webHidden/>
               </w:rPr>
-              <w:instrText xml:space="preserve"> PAGEREF _Toc199150447 \h </w:instrText>
+              <w:instrText xml:space="preserve"> PAGEREF _Toc214010209 \h </w:instrText>
             </w:r>
             <w:r>
               <w:rPr>
@@ -1288,7 +1288,7 @@
               <w14:ligatures w14:val="standardContextual"/>
             </w:rPr>
           </w:pPr>
-          <w:hyperlink w:anchor="_Toc199150448" w:history="1">
+          <w:hyperlink w:anchor="_Toc214010210" w:history="1">
             <w:r>
               <w:rPr>
                 <w:rStyle w:val="Hyperlink"/>
@@ -1311,7 +1311,7 @@
               <w:rPr>
                 <w:webHidden/>
               </w:rPr>
-              <w:instrText xml:space="preserve"> PAGEREF _Toc199150448 \h </w:instrText>
+              <w:instrText xml:space="preserve"> PAGEREF _Toc214010210 \h </w:instrText>
             </w:r>
             <w:r>
               <w:rPr>
@@ -1350,7 +1350,7 @@
               <w14:ligatures w14:val="standardContextual"/>
             </w:rPr>
           </w:pPr>
-          <w:hyperlink w:anchor="_Toc199150449" w:history="1">
+          <w:hyperlink w:anchor="_Toc214010211" w:history="1">
             <w:r>
               <w:rPr>
                 <w:rStyle w:val="Hyperlink"/>
@@ -1373,7 +1373,7 @@
               <w:rPr>
                 <w:webHidden/>
               </w:rPr>
-              <w:instrText xml:space="preserve"> PAGEREF _Toc199150449 \h </w:instrText>
+              <w:instrText xml:space="preserve"> PAGEREF _Toc214010211 \h </w:instrText>
             </w:r>
             <w:r>
               <w:rPr>
@@ -1412,13 +1412,13 @@
               <w14:ligatures w14:val="standardContextual"/>
             </w:rPr>
           </w:pPr>
-          <w:hyperlink w:anchor="_Toc199150450" w:history="1">
+          <w:hyperlink w:anchor="_Toc214010212" w:history="1">
             <w:r>
               <w:rPr>
                 <w:rStyle w:val="Hyperlink"/>
                 <w:bCs/>
               </w:rPr>
-              <w:t>PARTICIPACIONES ESTATALES MEMORIAS DE CÁLCULO</w:t>
+              <w:t>PARTICIPACIONES ESTATALES MEMORIAS DE CÁLCULOS</w:t>
             </w:r>
             <w:r>
               <w:rPr>
@@ -1436,7 +1436,7 @@
               <w:rPr>
                 <w:webHidden/>
               </w:rPr>
-              <w:instrText xml:space="preserve"> PAGEREF _Toc199150450 \h </w:instrText>
+              <w:instrText xml:space="preserve"> PAGEREF _Toc214010212 \h </w:instrText>
             </w:r>
             <w:r>
               <w:rPr>
@@ -1475,7 +1475,7 @@
               <w14:ligatures w14:val="standardContextual"/>
             </w:rPr>
           </w:pPr>
-          <w:hyperlink w:anchor="_Toc199150451" w:history="1">
+          <w:hyperlink w:anchor="_Toc214010213" w:history="1">
             <w:r>
               <w:rPr>
                 <w:rStyle w:val="Hyperlink"/>
@@ -1499,7 +1499,7 @@
               <w:rPr>
                 <w:webHidden/>
               </w:rPr>
-              <w:instrText xml:space="preserve"> PAGEREF _Toc199150451 \h </w:instrText>
+              <w:instrText xml:space="preserve"> PAGEREF _Toc214010213 \h </w:instrText>
             </w:r>
             <w:r>
               <w:rPr>
@@ -1538,12 +1538,12 @@
               <w14:ligatures w14:val="standardContextual"/>
             </w:rPr>
           </w:pPr>
-          <w:hyperlink w:anchor="_Toc199150452" w:history="1">
+          <w:hyperlink w:anchor="_Toc214010214" w:history="1">
             <w:r>
               <w:rPr>
                 <w:rStyle w:val="Hyperlink"/>
               </w:rPr>
-              <w:t>1.- Selección de Participaciones Estatales Memorias de Cálculo</w:t>
+              <w:t>1.- Selección de Participaciones Estatales Memorias de Cálculos</w:t>
             </w:r>
             <w:r>
               <w:rPr>
@@ -1561,7 +1561,7 @@
               <w:rPr>
                 <w:webHidden/>
               </w:rPr>
-              <w:instrText xml:space="preserve"> PAGEREF _Toc199150452 \h </w:instrText>
+              <w:instrText xml:space="preserve"> PAGEREF _Toc214010214 \h </w:instrText>
             </w:r>
             <w:r>
               <w:rPr>
@@ -1600,12 +1600,12 @@
               <w14:ligatures w14:val="standardContextual"/>
             </w:rPr>
           </w:pPr>
-          <w:hyperlink w:anchor="_Toc199150453" w:history="1">
+          <w:hyperlink w:anchor="_Toc214010215" w:history="1">
             <w:r>
               <w:rPr>
                 <w:rStyle w:val="Hyperlink"/>
               </w:rPr>
-              <w:t>2.- El “Usuario Capturador” podrá crear un nuevo registro de Participaciones Estatales Memorias de Cálculo</w:t>
+              <w:t>2.- El “Usuario Capturador” podrá crear un nuevo registro de Participaciones Estatales Memorias de Cálculos</w:t>
             </w:r>
             <w:r>
               <w:rPr>
@@ -1623,7 +1623,7 @@
               <w:rPr>
                 <w:webHidden/>
               </w:rPr>
-              <w:instrText xml:space="preserve"> PAGEREF _Toc199150453 \h </w:instrText>
+              <w:instrText xml:space="preserve"> PAGEREF _Toc214010215 \h </w:instrText>
             </w:r>
             <w:r>
               <w:rPr>
@@ -1662,7 +1662,7 @@
               <w14:ligatures w14:val="standardContextual"/>
             </w:rPr>
           </w:pPr>
-          <w:hyperlink w:anchor="_Toc199150454" w:history="1">
+          <w:hyperlink w:anchor="_Toc214010216" w:history="1">
             <w:r>
               <w:rPr>
                 <w:rStyle w:val="Hyperlink"/>
@@ -1685,7 +1685,7 @@
               <w:rPr>
                 <w:webHidden/>
               </w:rPr>
-              <w:instrText xml:space="preserve"> PAGEREF _Toc199150454 \h </w:instrText>
+              <w:instrText xml:space="preserve"> PAGEREF _Toc214010216 \h </w:instrText>
             </w:r>
             <w:r>
               <w:rPr>
@@ -1724,7 +1724,7 @@
               <w14:ligatures w14:val="standardContextual"/>
             </w:rPr>
           </w:pPr>
-          <w:hyperlink w:anchor="_Toc199150455" w:history="1">
+          <w:hyperlink w:anchor="_Toc214010217" w:history="1">
             <w:r>
               <w:rPr>
                 <w:rStyle w:val="Hyperlink"/>
@@ -1747,7 +1747,7 @@
               <w:rPr>
                 <w:webHidden/>
               </w:rPr>
-              <w:instrText xml:space="preserve"> PAGEREF _Toc199150455 \h </w:instrText>
+              <w:instrText xml:space="preserve"> PAGEREF _Toc214010217 \h </w:instrText>
             </w:r>
             <w:r>
               <w:rPr>
@@ -1786,12 +1786,12 @@
               <w14:ligatures w14:val="standardContextual"/>
             </w:rPr>
           </w:pPr>
-          <w:hyperlink w:anchor="_Toc199150456" w:history="1">
+          <w:hyperlink w:anchor="_Toc214010218" w:history="1">
             <w:r>
               <w:rPr>
                 <w:rStyle w:val="Hyperlink"/>
               </w:rPr>
-              <w:t>5.- Consulta de estatus</w:t>
+              <w:t>5.- Para eliminar los datos registrados de Participaciones Federales – Memorias de Cálculos</w:t>
             </w:r>
             <w:r>
               <w:rPr>
@@ -1809,7 +1809,7 @@
               <w:rPr>
                 <w:webHidden/>
               </w:rPr>
-              <w:instrText xml:space="preserve"> PAGEREF _Toc199150456 \h </w:instrText>
+              <w:instrText xml:space="preserve"> PAGEREF _Toc214010218 \h </w:instrText>
             </w:r>
             <w:r>
               <w:rPr>
@@ -1827,6 +1827,68 @@
                 <w:webHidden/>
               </w:rPr>
               <w:t>14</w:t>
+            </w:r>
+            <w:r>
+              <w:rPr>
+                <w:webHidden/>
+              </w:rPr>
+              <w:fldChar w:fldCharType="end"/>
+            </w:r>
+          </w:hyperlink>
+        </w:p>
+        <w:p>
+          <w:pPr>
+            <w:pStyle w:val="TOC1"/>
+            <w:rPr>
+              <w:rFonts w:eastAsiaTheme="minorEastAsia" w:cstheme="minorBidi"/>
+              <w:kern w:val="2"/>
+              <w:sz w:val="24"/>
+              <w:szCs w:val="24"/>
+              <w:lang w:val="en-MX"/>
+              <w14:ligatures w14:val="standardContextual"/>
+            </w:rPr>
+          </w:pPr>
+          <w:hyperlink w:anchor="_Toc214010219" w:history="1">
+            <w:r>
+              <w:rPr>
+                <w:rStyle w:val="Hyperlink"/>
+              </w:rPr>
+              <w:t>6.- Consulta de estatus</w:t>
+            </w:r>
+            <w:r>
+              <w:rPr>
+                <w:webHidden/>
+              </w:rPr>
+              <w:tab/>
+            </w:r>
+            <w:r>
+              <w:rPr>
+                <w:webHidden/>
+              </w:rPr>
+              <w:fldChar w:fldCharType="begin"/>
+            </w:r>
+            <w:r>
+              <w:rPr>
+                <w:webHidden/>
+              </w:rPr>
+              <w:instrText xml:space="preserve"> PAGEREF _Toc214010219 \h </w:instrText>
+            </w:r>
+            <w:r>
+              <w:rPr>
+                <w:webHidden/>
+              </w:rPr>
+            </w:r>
+            <w:r>
+              <w:rPr>
+                <w:webHidden/>
+              </w:rPr>
+              <w:fldChar w:fldCharType="separate"/>
+            </w:r>
+            <w:r>
+              <w:rPr>
+                <w:webHidden/>
+              </w:rPr>
+              <w:t>16</w:t>
             </w:r>
             <w:r>
               <w:rPr>
@@ -2189,16 +2251,7 @@
                                 <w:szCs w:val="24"/>
                                 <w:lang w:val="es-MX"/>
                               </w:rPr>
-                              <w:t xml:space="preserve"> Gestión </w:t>
-                            </w:r>
-                            <w:r>
-                              <w:rPr>
-                                <w:rFonts w:ascii="Arial" w:hAnsi="Arial" w:cs="Arial"/>
-                                <w:sz w:val="24"/>
-                                <w:szCs w:val="24"/>
-                                <w:lang w:val="es-MX"/>
-                              </w:rPr>
-                              <w:t xml:space="preserve">de </w:t>
+                              <w:t xml:space="preserve"> Gestión de </w:t>
                             </w:r>
                             <w:r>
                               <w:rPr>
@@ -2698,7 +2751,7 @@
         </w:rPr>
       </w:pPr>
       <w:bookmarkStart w:id="0" w:name="_Toc123297018"/>
-      <w:bookmarkStart w:id="1" w:name="_Toc199150447"/>
+      <w:bookmarkStart w:id="1" w:name="_Toc214010209"/>
       <w:r>
         <w:rPr>
           <w:rFonts w:cs="Arial"/>
@@ -2873,7 +2926,7 @@
         </w:rPr>
       </w:pPr>
       <w:bookmarkStart w:id="2" w:name="_Toc123297019"/>
-      <w:bookmarkStart w:id="3" w:name="_Toc199150448"/>
+      <w:bookmarkStart w:id="3" w:name="_Toc214010210"/>
       <w:r>
         <w:rPr>
           <w:rFonts w:cs="Arial"/>
@@ -3029,7 +3082,7 @@
         </w:rPr>
       </w:pPr>
       <w:bookmarkStart w:id="4" w:name="_Toc123297020"/>
-      <w:bookmarkStart w:id="5" w:name="_Toc199150449"/>
+      <w:bookmarkStart w:id="5" w:name="_Toc214010211"/>
       <w:r>
         <w:rPr>
           <w:rFonts w:cs="Arial"/>
@@ -3246,7 +3299,7 @@
           <w:szCs w:val="44"/>
         </w:rPr>
       </w:pPr>
-      <w:bookmarkStart w:id="6" w:name="_Toc199150450"/>
+      <w:bookmarkStart w:id="6" w:name="_Toc214010212"/>
       <w:r>
         <w:rPr>
           <w:rFonts w:cs="Arial"/>
@@ -3291,7 +3344,6 @@
         </w:rPr>
         <w:t>MEMORIAS DE CÁLCULO</w:t>
       </w:r>
-      <w:bookmarkEnd w:id="6"/>
       <w:r>
         <w:rPr>
           <w:rFonts w:cs="Arial"/>
@@ -3301,13 +3353,10 @@
           <w:sz w:val="44"/>
           <w:szCs w:val="44"/>
         </w:rPr>
-        <w:t xml:space="preserve"> </w:t>
-      </w:r>
-    </w:p>
-    <w:p>
-      <w:pPr>
-        <w:pStyle w:val="Heading1"/>
-        <w:jc w:val="center"/>
+        <w:t>S</w:t>
+      </w:r>
+      <w:bookmarkEnd w:id="6"/>
+      <w:r>
         <w:rPr>
           <w:rFonts w:cs="Arial"/>
           <w:b w:val="0"/>
@@ -3316,9 +3365,13 @@
           <w:sz w:val="44"/>
           <w:szCs w:val="44"/>
         </w:rPr>
-      </w:pPr>
-      <w:bookmarkStart w:id="7" w:name="_Toc199150451"/>
-      <w:r>
+        <w:t xml:space="preserve"> </w:t>
+      </w:r>
+    </w:p>
+    <w:p>
+      <w:pPr>
+        <w:pStyle w:val="Heading1"/>
+        <w:jc w:val="center"/>
         <w:rPr>
           <w:rFonts w:cs="Arial"/>
           <w:b w:val="0"/>
@@ -3327,8 +3380,8 @@
           <w:sz w:val="44"/>
           <w:szCs w:val="44"/>
         </w:rPr>
-        <w:t>(</w:t>
-      </w:r>
+      </w:pPr>
+      <w:bookmarkStart w:id="7" w:name="_Toc214010213"/>
       <w:r>
         <w:rPr>
           <w:rFonts w:cs="Arial"/>
@@ -3338,7 +3391,7 @@
           <w:sz w:val="44"/>
           <w:szCs w:val="44"/>
         </w:rPr>
-        <w:t>PPAFE</w:t>
+        <w:t>(</w:t>
       </w:r>
       <w:r>
         <w:rPr>
@@ -3349,6 +3402,17 @@
           <w:sz w:val="44"/>
           <w:szCs w:val="44"/>
         </w:rPr>
+        <w:t>PPAFE</w:t>
+      </w:r>
+      <w:r>
+        <w:rPr>
+          <w:rFonts w:cs="Arial"/>
+          <w:b w:val="0"/>
+          <w:bCs/>
+          <w:color w:val="auto"/>
+          <w:sz w:val="44"/>
+          <w:szCs w:val="44"/>
+        </w:rPr>
         <w:t>)</w:t>
       </w:r>
       <w:bookmarkEnd w:id="7"/>
@@ -3498,7 +3562,7 @@
       </w:pPr>
       <w:bookmarkStart w:id="8" w:name="_Toc123565162"/>
       <w:bookmarkStart w:id="9" w:name="_Toc124341669"/>
-      <w:bookmarkStart w:id="10" w:name="_Toc199150452"/>
+      <w:bookmarkStart w:id="10" w:name="_Toc214010214"/>
       <w:r>
         <w:rPr>
           <w:rFonts w:cs="Arial"/>
@@ -3540,6 +3604,14 @@
           <w:color w:val="auto"/>
         </w:rPr>
         <w:t>Memorias de Cálculo</w:t>
+      </w:r>
+      <w:r>
+        <w:rPr>
+          <w:rFonts w:cs="Arial"/>
+          <w:b w:val="0"/>
+          <w:color w:val="auto"/>
+        </w:rPr>
+        <w:t>s</w:t>
       </w:r>
       <w:bookmarkEnd w:id="10"/>
     </w:p>
@@ -3752,6 +3824,14 @@
           <w:szCs w:val="24"/>
         </w:rPr>
         <w:t>Memorias de Cálculo</w:t>
+      </w:r>
+      <w:r>
+        <w:rPr>
+          <w:rFonts w:ascii="Arial" w:hAnsi="Arial" w:cs="Arial"/>
+          <w:sz w:val="24"/>
+          <w:szCs w:val="24"/>
+        </w:rPr>
+        <w:t>s</w:t>
       </w:r>
       <w:r>
         <w:rPr>
@@ -3964,7 +4044,7 @@
           <w:szCs w:val="24"/>
         </w:rPr>
         <w:drawing>
-          <wp:inline distT="0" distB="0" distL="0" distR="0" wp14:anchorId="36A536B4" wp14:editId="69AAEBBC">
+          <wp:inline distT="0" distB="0" distL="0" distR="0" wp14:anchorId="36A536B4" wp14:editId="0C2D0A26">
             <wp:extent cx="1160795" cy="2370455"/>
             <wp:effectExtent l="152400" t="152400" r="337820" b="347345"/>
             <wp:docPr id="1598261574" name="Picture 1"/>
@@ -4092,26 +4172,6 @@
     </w:p>
     <w:p>
       <w:pPr>
-        <w:rPr>
-          <w:rFonts w:ascii="Arial" w:hAnsi="Arial" w:cs="Arial"/>
-          <w:b/>
-          <w:sz w:val="24"/>
-          <w:szCs w:val="24"/>
-        </w:rPr>
-      </w:pPr>
-    </w:p>
-    <w:p>
-      <w:pPr>
-        <w:rPr>
-          <w:rFonts w:ascii="Arial" w:hAnsi="Arial" w:cs="Arial"/>
-          <w:b/>
-          <w:sz w:val="24"/>
-          <w:szCs w:val="24"/>
-        </w:rPr>
-      </w:pPr>
-    </w:p>
-    <w:p>
-      <w:pPr>
         <w:pStyle w:val="Heading1"/>
         <w:spacing w:line="276" w:lineRule="auto"/>
         <w:jc w:val="center"/>
@@ -4123,7 +4183,7 @@
       </w:pPr>
       <w:bookmarkStart w:id="11" w:name="_Toc123565163"/>
       <w:bookmarkStart w:id="12" w:name="_Toc124341670"/>
-      <w:bookmarkStart w:id="13" w:name="_Toc199150453"/>
+      <w:bookmarkStart w:id="13" w:name="_Toc214010215"/>
       <w:r>
         <w:rPr>
           <w:rFonts w:cs="Arial"/>
@@ -4182,6 +4242,14 @@
         </w:rPr>
         <w:t>Memorias de Cálculo</w:t>
       </w:r>
+      <w:r>
+        <w:rPr>
+          <w:rFonts w:cs="Arial"/>
+          <w:b w:val="0"/>
+          <w:color w:val="auto"/>
+        </w:rPr>
+        <w:t>s</w:t>
+      </w:r>
       <w:bookmarkEnd w:id="13"/>
     </w:p>
     <w:p>
@@ -4291,8 +4359,64 @@
           <w:rFonts w:ascii="Arial" w:hAnsi="Arial" w:cs="Arial"/>
           <w:sz w:val="24"/>
           <w:szCs w:val="24"/>
-        </w:rPr>
-      </w:pPr>
+          <w:lang w:val="es-MX"/>
+        </w:rPr>
+      </w:pPr>
+      <w:r>
+        <w:rPr>
+          <w:rFonts w:ascii="Arial" w:hAnsi="Arial" w:cs="Arial"/>
+          <w:noProof/>
+          <w:lang w:val="es-MX" w:eastAsia="es-MX"/>
+        </w:rPr>
+        <w:drawing>
+          <wp:inline distT="0" distB="0" distL="0" distR="0" wp14:anchorId="42D01B39" wp14:editId="6576732A">
+            <wp:extent cx="5040000" cy="2464684"/>
+            <wp:effectExtent l="152400" t="152400" r="332105" b="342265"/>
+            <wp:docPr id="1514244291" name="Picture 1"/>
+            <wp:cNvGraphicFramePr>
+              <a:graphicFrameLocks xmlns:a="http://schemas.openxmlformats.org/drawingml/2006/main" noChangeAspect="1"/>
+            </wp:cNvGraphicFramePr>
+            <a:graphic xmlns:a="http://schemas.openxmlformats.org/drawingml/2006/main">
+              <a:graphicData uri="http://schemas.openxmlformats.org/drawingml/2006/picture">
+                <pic:pic xmlns:pic="http://schemas.openxmlformats.org/drawingml/2006/picture">
+                  <pic:nvPicPr>
+                    <pic:cNvPr id="1514244291" name="Picture 1514244291"/>
+                    <pic:cNvPicPr/>
+                  </pic:nvPicPr>
+                  <pic:blipFill>
+                    <a:blip r:embed="rId11" cstate="print">
+                      <a:extLst>
+                        <a:ext uri="{28A0092B-C50C-407E-A947-70E740481C1C}">
+                          <a14:useLocalDpi xmlns:a14="http://schemas.microsoft.com/office/drawing/2010/main" val="0"/>
+                        </a:ext>
+                      </a:extLst>
+                    </a:blip>
+                    <a:stretch>
+                      <a:fillRect/>
+                    </a:stretch>
+                  </pic:blipFill>
+                  <pic:spPr>
+                    <a:xfrm>
+                      <a:off x="0" y="0"/>
+                      <a:ext cx="5040000" cy="2464684"/>
+                    </a:xfrm>
+                    <a:prstGeom prst="rect">
+                      <a:avLst/>
+                    </a:prstGeom>
+                    <a:effectLst>
+                      <a:outerShdw blurRad="292100" dist="139700" dir="2700000" algn="ctr" rotWithShape="0">
+                        <a:srgbClr val="000000">
+                          <a:alpha val="65000"/>
+                        </a:srgbClr>
+                      </a:outerShdw>
+                    </a:effectLst>
+                  </pic:spPr>
+                </pic:pic>
+              </a:graphicData>
+            </a:graphic>
+          </wp:inline>
+        </w:drawing>
+      </w:r>
       <w:r>
         <w:rPr>
           <w:rFonts w:ascii="Arial" w:hAnsi="Arial" w:cs="Arial"/>
@@ -4373,62 +4497,6 @@
           </mc:Fallback>
         </mc:AlternateContent>
       </w:r>
-      <w:r>
-        <w:rPr>
-          <w:rFonts w:ascii="Arial" w:hAnsi="Arial" w:cs="Arial"/>
-          <w:noProof/>
-          <w:sz w:val="24"/>
-          <w:szCs w:val="24"/>
-        </w:rPr>
-        <w:drawing>
-          <wp:inline distT="0" distB="0" distL="0" distR="0" wp14:anchorId="4F098BFE" wp14:editId="05C174CF">
-            <wp:extent cx="5400000" cy="2458656"/>
-            <wp:effectExtent l="152400" t="152400" r="328295" b="348615"/>
-            <wp:docPr id="1285638140" name="Picture 2"/>
-            <wp:cNvGraphicFramePr>
-              <a:graphicFrameLocks xmlns:a="http://schemas.openxmlformats.org/drawingml/2006/main" noChangeAspect="1"/>
-            </wp:cNvGraphicFramePr>
-            <a:graphic xmlns:a="http://schemas.openxmlformats.org/drawingml/2006/main">
-              <a:graphicData uri="http://schemas.openxmlformats.org/drawingml/2006/picture">
-                <pic:pic xmlns:pic="http://schemas.openxmlformats.org/drawingml/2006/picture">
-                  <pic:nvPicPr>
-                    <pic:cNvPr id="1285638140" name="Picture 1285638140"/>
-                    <pic:cNvPicPr/>
-                  </pic:nvPicPr>
-                  <pic:blipFill>
-                    <a:blip r:embed="rId11" cstate="print">
-                      <a:extLst>
-                        <a:ext uri="{28A0092B-C50C-407E-A947-70E740481C1C}">
-                          <a14:useLocalDpi xmlns:a14="http://schemas.microsoft.com/office/drawing/2010/main" val="0"/>
-                        </a:ext>
-                      </a:extLst>
-                    </a:blip>
-                    <a:stretch>
-                      <a:fillRect/>
-                    </a:stretch>
-                  </pic:blipFill>
-                  <pic:spPr>
-                    <a:xfrm>
-                      <a:off x="0" y="0"/>
-                      <a:ext cx="5400000" cy="2458656"/>
-                    </a:xfrm>
-                    <a:prstGeom prst="rect">
-                      <a:avLst/>
-                    </a:prstGeom>
-                    <a:effectLst>
-                      <a:outerShdw blurRad="292100" dist="139700" dir="2700000" algn="ctr" rotWithShape="0">
-                        <a:srgbClr val="000000">
-                          <a:alpha val="65000"/>
-                        </a:srgbClr>
-                      </a:outerShdw>
-                    </a:effectLst>
-                  </pic:spPr>
-                </pic:pic>
-              </a:graphicData>
-            </a:graphic>
-          </wp:inline>
-        </w:drawing>
-      </w:r>
     </w:p>
     <w:p>
       <w:pPr>
@@ -5073,7 +5141,7 @@
           <w:lang w:val="es-MX" w:eastAsia="es-MX"/>
         </w:rPr>
         <w:drawing>
-          <wp:inline distT="0" distB="0" distL="0" distR="0" wp14:anchorId="3D8F8A20" wp14:editId="7956E500">
+          <wp:inline distT="0" distB="0" distL="0" distR="0" wp14:anchorId="3D8F8A20" wp14:editId="18ED5F87">
             <wp:extent cx="5400000" cy="2298574"/>
             <wp:effectExtent l="152400" t="152400" r="328295" b="343535"/>
             <wp:docPr id="2012964779" name="Picture 5"/>
@@ -5524,7 +5592,7 @@
                     <pic:cNvPicPr/>
                   </pic:nvPicPr>
                   <pic:blipFill>
-                    <a:blip r:embed="rId11" cstate="print">
+                    <a:blip r:embed="rId14" cstate="print">
                       <a:extLst>
                         <a:ext uri="{28A0092B-C50C-407E-A947-70E740481C1C}">
                           <a14:useLocalDpi xmlns:a14="http://schemas.microsoft.com/office/drawing/2010/main" val="0"/>
@@ -5955,6 +6023,14 @@
               </w:rPr>
               <w:t>Memorias de Cálculo</w:t>
             </w:r>
+            <w:r>
+              <w:rPr>
+                <w:rFonts w:ascii="Arial" w:hAnsi="Arial" w:cs="Arial"/>
+                <w:sz w:val="24"/>
+                <w:szCs w:val="24"/>
+              </w:rPr>
+              <w:t>s</w:t>
+            </w:r>
           </w:p>
         </w:tc>
       </w:tr>
@@ -6060,6 +6136,14 @@
                 <w:sz w:val="24"/>
                 <w:szCs w:val="24"/>
               </w:rPr>
+              <w:t>s</w:t>
+            </w:r>
+            <w:r>
+              <w:rPr>
+                <w:rFonts w:ascii="Arial" w:hAnsi="Arial" w:cs="Arial"/>
+                <w:sz w:val="24"/>
+                <w:szCs w:val="24"/>
+              </w:rPr>
               <w:t xml:space="preserve"> del </w:t>
             </w:r>
             <w:r>
@@ -6134,7 +6218,7 @@
       </w:pPr>
       <w:bookmarkStart w:id="14" w:name="_Toc123565164"/>
       <w:bookmarkStart w:id="15" w:name="_Toc124341671"/>
-      <w:bookmarkStart w:id="16" w:name="_Toc199150454"/>
+      <w:bookmarkStart w:id="16" w:name="_Toc214010216"/>
       <w:r>
         <w:rPr>
           <w:rFonts w:cs="Arial"/>
@@ -6242,6 +6326,14 @@
           <w:szCs w:val="24"/>
         </w:rPr>
         <w:t>Memorias de Cálculo</w:t>
+      </w:r>
+      <w:r>
+        <w:rPr>
+          <w:rFonts w:ascii="Arial" w:hAnsi="Arial" w:cs="Arial"/>
+          <w:sz w:val="24"/>
+          <w:szCs w:val="24"/>
+        </w:rPr>
+        <w:t>s</w:t>
       </w:r>
       <w:r>
         <w:rPr>
@@ -6274,7 +6366,7 @@
                     <pic:cNvPicPr/>
                   </pic:nvPicPr>
                   <pic:blipFill>
-                    <a:blip r:embed="rId14">
+                    <a:blip r:embed="rId15">
                       <a:extLst>
                         <a:ext uri="{28A0092B-C50C-407E-A947-70E740481C1C}">
                           <a14:useLocalDpi xmlns:a14="http://schemas.microsoft.com/office/drawing/2010/main" val="0"/>
@@ -6319,16 +6411,16 @@
         <mc:AlternateContent>
           <mc:Choice Requires="wps">
             <w:drawing>
-              <wp:anchor distT="0" distB="0" distL="114300" distR="114300" simplePos="0" relativeHeight="251835392" behindDoc="0" locked="0" layoutInCell="1" allowOverlap="1" wp14:anchorId="6A1265CF" wp14:editId="32C73711">
+              <wp:anchor distT="0" distB="0" distL="114300" distR="114300" simplePos="0" relativeHeight="251835392" behindDoc="0" locked="0" layoutInCell="1" allowOverlap="1" wp14:anchorId="6A1265CF" wp14:editId="51750FBE">
                 <wp:simplePos x="0" y="0"/>
                 <wp:positionH relativeFrom="column">
-                  <wp:posOffset>402945</wp:posOffset>
+                  <wp:posOffset>406400</wp:posOffset>
                 </wp:positionH>
                 <wp:positionV relativeFrom="paragraph">
-                  <wp:posOffset>906897</wp:posOffset>
+                  <wp:posOffset>910026</wp:posOffset>
                 </wp:positionV>
                 <wp:extent cx="132368" cy="140220"/>
-                <wp:effectExtent l="0" t="0" r="20320" b="12700"/>
+                <wp:effectExtent l="0" t="0" r="7620" b="12700"/>
                 <wp:wrapNone/>
                 <wp:docPr id="36" name="Rectángulo 36"/>
                 <wp:cNvGraphicFramePr/>
@@ -6387,7 +6479,7 @@
           </mc:Choice>
           <mc:Fallback>
             <w:pict>
-              <v:rect w14:anchorId="037D5EE0" id="Rectángulo 36" o:spid="_x0000_s1026" style="position:absolute;margin-left:31.75pt;margin-top:71.4pt;width:10.4pt;height:11.05pt;z-index:251835392;visibility:visible;mso-wrap-style:square;mso-width-percent:0;mso-height-percent:0;mso-wrap-distance-left:9pt;mso-wrap-distance-top:0;mso-wrap-distance-right:9pt;mso-wrap-distance-bottom:0;mso-position-horizontal:absolute;mso-position-horizontal-relative:text;mso-position-vertical:absolute;mso-position-vertical-relative:text;mso-width-percent:0;mso-height-percent:0;mso-width-relative:margin;mso-height-relative:margin;v-text-anchor:middle" o:gfxdata="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" filled="f" strokecolor="red" strokeweight="1pt"/>
+              <v:rect w14:anchorId="1514DF9C" id="Rectángulo 36" o:spid="_x0000_s1026" style="position:absolute;margin-left:32pt;margin-top:71.65pt;width:10.4pt;height:11.05pt;z-index:251835392;visibility:visible;mso-wrap-style:square;mso-width-percent:0;mso-height-percent:0;mso-wrap-distance-left:9pt;mso-wrap-distance-top:0;mso-wrap-distance-right:9pt;mso-wrap-distance-bottom:0;mso-position-horizontal:absolute;mso-position-horizontal-relative:text;mso-position-vertical:absolute;mso-position-vertical-relative:text;mso-width-percent:0;mso-height-percent:0;mso-width-relative:margin;mso-height-relative:margin;v-text-anchor:middle" o:gfxdata="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" filled="f" strokecolor="red" strokeweight="1pt"/>
             </w:pict>
           </mc:Fallback>
         </mc:AlternateContent>
@@ -6400,10 +6492,10 @@
           <w:szCs w:val="24"/>
         </w:rPr>
         <w:drawing>
-          <wp:inline distT="0" distB="0" distL="0" distR="0" wp14:anchorId="0B587EB3" wp14:editId="0765BFEB">
+          <wp:inline distT="0" distB="0" distL="0" distR="0" wp14:anchorId="61E68CE3" wp14:editId="64B7BE0C">
             <wp:extent cx="5400000" cy="2458656"/>
             <wp:effectExtent l="152400" t="152400" r="328295" b="348615"/>
-            <wp:docPr id="1231881075" name="Picture 2"/>
+            <wp:docPr id="619959237" name="Picture 2"/>
             <wp:cNvGraphicFramePr>
               <a:graphicFrameLocks xmlns:a="http://schemas.openxmlformats.org/drawingml/2006/main" noChangeAspect="1"/>
             </wp:cNvGraphicFramePr>
@@ -6415,7 +6507,7 @@
                     <pic:cNvPicPr/>
                   </pic:nvPicPr>
                   <pic:blipFill>
-                    <a:blip r:embed="rId11" cstate="print">
+                    <a:blip r:embed="rId14" cstate="print">
                       <a:extLst>
                         <a:ext uri="{28A0092B-C50C-407E-A947-70E740481C1C}">
                           <a14:useLocalDpi xmlns:a14="http://schemas.microsoft.com/office/drawing/2010/main" val="0"/>
@@ -6580,7 +6672,7 @@
                     <pic:cNvPicPr/>
                   </pic:nvPicPr>
                   <pic:blipFill>
-                    <a:blip r:embed="rId15" cstate="print">
+                    <a:blip r:embed="rId16" cstate="print">
                       <a:extLst>
                         <a:ext uri="{28A0092B-C50C-407E-A947-70E740481C1C}">
                           <a14:useLocalDpi xmlns:a14="http://schemas.microsoft.com/office/drawing/2010/main" val="0"/>
@@ -6744,7 +6836,7 @@
           <w:sz w:val="24"/>
           <w:szCs w:val="24"/>
         </w:rPr>
-        <w:t>Aprobar</w:t>
+        <w:t>Validar</w:t>
       </w:r>
       <w:r>
         <w:rPr>
@@ -6779,7 +6871,7 @@
           <w:sz w:val="24"/>
           <w:szCs w:val="24"/>
         </w:rPr>
-        <w:t>Aprobar</w:t>
+        <w:t>Validar</w:t>
       </w:r>
       <w:r>
         <w:rPr>
@@ -6849,16 +6941,16 @@
         <mc:AlternateContent>
           <mc:Choice Requires="wps">
             <w:drawing>
-              <wp:anchor distT="0" distB="0" distL="114300" distR="114300" simplePos="0" relativeHeight="251844608" behindDoc="0" locked="0" layoutInCell="1" allowOverlap="1" wp14:anchorId="394A7C63" wp14:editId="030AB28D">
+              <wp:anchor distT="0" distB="0" distL="114300" distR="114300" simplePos="0" relativeHeight="251844608" behindDoc="0" locked="0" layoutInCell="1" allowOverlap="1" wp14:anchorId="394A7C63" wp14:editId="3430F1F5">
                 <wp:simplePos x="0" y="0"/>
                 <wp:positionH relativeFrom="margin">
-                  <wp:posOffset>2025737</wp:posOffset>
+                  <wp:posOffset>3899535</wp:posOffset>
                 </wp:positionH>
                 <wp:positionV relativeFrom="paragraph">
-                  <wp:posOffset>875369</wp:posOffset>
+                  <wp:posOffset>834954</wp:posOffset>
                 </wp:positionV>
                 <wp:extent cx="296545" cy="168275"/>
-                <wp:effectExtent l="19050" t="19050" r="27305" b="22225"/>
+                <wp:effectExtent l="12700" t="12700" r="8255" b="9525"/>
                 <wp:wrapNone/>
                 <wp:docPr id="3" name="Rectángulo 3"/>
                 <wp:cNvGraphicFramePr/>
@@ -6915,7 +7007,7 @@
           </mc:Choice>
           <mc:Fallback>
             <w:pict>
-              <v:rect w14:anchorId="548EF23C" id="Rectángulo 3" o:spid="_x0000_s1026" style="position:absolute;margin-left:159.5pt;margin-top:68.95pt;width:23.35pt;height:13.25pt;z-index:251844608;visibility:visible;mso-wrap-style:square;mso-width-percent:0;mso-height-percent:0;mso-wrap-distance-left:9pt;mso-wrap-distance-top:0;mso-wrap-distance-right:9pt;mso-wrap-distance-bottom:0;mso-position-horizontal:absolute;mso-position-horizontal-relative:margin;mso-position-vertical:absolute;mso-position-vertical-relative:text;mso-width-percent:0;mso-height-percent:0;mso-width-relative:margin;mso-height-relative:margin;v-text-anchor:middle" o:gfxdata="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" filled="f" strokecolor="red" strokeweight="2.25pt">
+              <v:rect w14:anchorId="48CE1722" id="Rectángulo 3" o:spid="_x0000_s1026" style="position:absolute;margin-left:307.05pt;margin-top:65.75pt;width:23.35pt;height:13.25pt;z-index:251844608;visibility:visible;mso-wrap-style:square;mso-width-percent:0;mso-height-percent:0;mso-wrap-distance-left:9pt;mso-wrap-distance-top:0;mso-wrap-distance-right:9pt;mso-wrap-distance-bottom:0;mso-position-horizontal:absolute;mso-position-horizontal-relative:margin;mso-position-vertical:absolute;mso-position-vertical-relative:text;mso-width-percent:0;mso-height-percent:0;mso-width-relative:margin;mso-height-relative:margin;v-text-anchor:middle" o:gfxdata="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" filled="f" strokecolor="red" strokeweight="2.25pt">
                 <w10:wrap anchorx="margin"/>
               </v:rect>
             </w:pict>
@@ -6926,14 +7018,13 @@
         <w:rPr>
           <w:rFonts w:ascii="Arial" w:hAnsi="Arial" w:cs="Arial"/>
           <w:noProof/>
-          <w:sz w:val="24"/>
-          <w:szCs w:val="24"/>
+          <w:lang w:val="es-MX" w:eastAsia="es-MX"/>
         </w:rPr>
         <w:drawing>
-          <wp:inline distT="0" distB="0" distL="0" distR="0" wp14:anchorId="336FC772" wp14:editId="268996AA">
-            <wp:extent cx="5400000" cy="2458656"/>
-            <wp:effectExtent l="152400" t="152400" r="328295" b="348615"/>
-            <wp:docPr id="1523808514" name="Picture 2"/>
+          <wp:inline distT="0" distB="0" distL="0" distR="0" wp14:anchorId="5B4D20C6" wp14:editId="058D4DC6">
+            <wp:extent cx="5040000" cy="2464684"/>
+            <wp:effectExtent l="152400" t="152400" r="332105" b="342265"/>
+            <wp:docPr id="1930227925" name="Picture 1"/>
             <wp:cNvGraphicFramePr>
               <a:graphicFrameLocks xmlns:a="http://schemas.openxmlformats.org/drawingml/2006/main" noChangeAspect="1"/>
             </wp:cNvGraphicFramePr>
@@ -6941,7 +7032,7 @@
               <a:graphicData uri="http://schemas.openxmlformats.org/drawingml/2006/picture">
                 <pic:pic xmlns:pic="http://schemas.openxmlformats.org/drawingml/2006/picture">
                   <pic:nvPicPr>
-                    <pic:cNvPr id="1285638140" name="Picture 1285638140"/>
+                    <pic:cNvPr id="1514244291" name="Picture 1514244291"/>
                     <pic:cNvPicPr/>
                   </pic:nvPicPr>
                   <pic:blipFill>
@@ -6959,7 +7050,7 @@
                   <pic:spPr>
                     <a:xfrm>
                       <a:off x="0" y="0"/>
-                      <a:ext cx="5400000" cy="2458656"/>
+                      <a:ext cx="5040000" cy="2464684"/>
                     </a:xfrm>
                     <a:prstGeom prst="rect">
                       <a:avLst/>
@@ -7018,7 +7109,7 @@
       </w:pPr>
       <w:bookmarkStart w:id="17" w:name="_Toc124161440"/>
       <w:bookmarkStart w:id="18" w:name="_Toc124341672"/>
-      <w:bookmarkStart w:id="19" w:name="_Toc199150455"/>
+      <w:bookmarkStart w:id="19" w:name="_Toc214010217"/>
       <w:r>
         <w:rPr>
           <w:rFonts w:cs="Arial"/>
@@ -7078,6 +7169,14 @@
           <w:sz w:val="24"/>
           <w:szCs w:val="24"/>
         </w:rPr>
+        <w:t>s</w:t>
+      </w:r>
+      <w:r>
+        <w:rPr>
+          <w:rFonts w:ascii="Arial" w:hAnsi="Arial" w:cs="Arial"/>
+          <w:sz w:val="24"/>
+          <w:szCs w:val="24"/>
+        </w:rPr>
         <w:t>.</w:t>
       </w:r>
       <w:r>
@@ -7135,6 +7234,14 @@
           <w:szCs w:val="24"/>
         </w:rPr>
         <w:t>Memorias de Cálculo</w:t>
+      </w:r>
+      <w:r>
+        <w:rPr>
+          <w:rFonts w:ascii="Arial" w:hAnsi="Arial" w:cs="Arial"/>
+          <w:sz w:val="24"/>
+          <w:szCs w:val="24"/>
+        </w:rPr>
+        <w:t>s</w:t>
       </w:r>
       <w:r>
         <w:rPr>
@@ -7179,13 +7286,13 @@
         <mc:AlternateContent>
           <mc:Choice Requires="wps">
             <w:drawing>
-              <wp:anchor distT="0" distB="0" distL="114300" distR="114300" simplePos="0" relativeHeight="251854848" behindDoc="0" locked="0" layoutInCell="1" allowOverlap="1" wp14:anchorId="790D5566" wp14:editId="2B50E08A">
+              <wp:anchor distT="0" distB="0" distL="114300" distR="114300" simplePos="0" relativeHeight="251854848" behindDoc="0" locked="0" layoutInCell="1" allowOverlap="1" wp14:anchorId="790D5566" wp14:editId="5672250D">
                 <wp:simplePos x="0" y="0"/>
                 <wp:positionH relativeFrom="column">
                   <wp:posOffset>400050</wp:posOffset>
                 </wp:positionH>
                 <wp:positionV relativeFrom="paragraph">
-                  <wp:posOffset>917180</wp:posOffset>
+                  <wp:posOffset>1005276</wp:posOffset>
                 </wp:positionV>
                 <wp:extent cx="152400" cy="114646"/>
                 <wp:effectExtent l="12700" t="12700" r="12700" b="12700"/>
@@ -7245,7 +7352,7 @@
           </mc:Choice>
           <mc:Fallback>
             <w:pict>
-              <v:rect w14:anchorId="3E6ABC24" id="Rectángulo 44" o:spid="_x0000_s1026" style="position:absolute;margin-left:31.5pt;margin-top:72.2pt;width:12pt;height:9.05pt;z-index:251854848;visibility:visible;mso-wrap-style:square;mso-width-percent:0;mso-height-percent:0;mso-wrap-distance-left:9pt;mso-wrap-distance-top:0;mso-wrap-distance-right:9pt;mso-wrap-distance-bottom:0;mso-position-horizontal:absolute;mso-position-horizontal-relative:text;mso-position-vertical:absolute;mso-position-vertical-relative:text;mso-width-percent:0;mso-height-percent:0;mso-width-relative:margin;mso-height-relative:margin;v-text-anchor:middle" o:gfxdata="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" filled="f" strokecolor="red" strokeweight="2.25pt"/>
+              <v:rect w14:anchorId="6FD3FE75" id="Rectángulo 44" o:spid="_x0000_s1026" style="position:absolute;margin-left:31.5pt;margin-top:79.15pt;width:12pt;height:9.05pt;z-index:251854848;visibility:visible;mso-wrap-style:square;mso-width-percent:0;mso-height-percent:0;mso-wrap-distance-left:9pt;mso-wrap-distance-top:0;mso-wrap-distance-right:9pt;mso-wrap-distance-bottom:0;mso-position-horizontal:absolute;mso-position-horizontal-relative:text;mso-position-vertical:absolute;mso-position-vertical-relative:text;mso-width-percent:0;mso-height-percent:0;mso-width-relative:margin;mso-height-relative:margin;v-text-anchor:middle" o:gfxdata="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" filled="f" strokecolor="red" strokeweight="2.25pt"/>
             </w:pict>
           </mc:Fallback>
         </mc:AlternateContent>
@@ -7254,14 +7361,13 @@
         <w:rPr>
           <w:rFonts w:ascii="Arial" w:hAnsi="Arial" w:cs="Arial"/>
           <w:noProof/>
-          <w:sz w:val="24"/>
-          <w:szCs w:val="24"/>
+          <w:lang w:val="es-MX" w:eastAsia="es-MX"/>
         </w:rPr>
         <w:drawing>
-          <wp:inline distT="0" distB="0" distL="0" distR="0" wp14:anchorId="1BCD0DC8" wp14:editId="76DD6571">
-            <wp:extent cx="5400000" cy="2458656"/>
-            <wp:effectExtent l="152400" t="152400" r="328295" b="348615"/>
-            <wp:docPr id="348014419" name="Picture 2"/>
+          <wp:inline distT="0" distB="0" distL="0" distR="0" wp14:anchorId="5DE36B61" wp14:editId="649D6735">
+            <wp:extent cx="5040000" cy="2464684"/>
+            <wp:effectExtent l="152400" t="152400" r="332105" b="342265"/>
+            <wp:docPr id="2020083881" name="Picture 1"/>
             <wp:cNvGraphicFramePr>
               <a:graphicFrameLocks xmlns:a="http://schemas.openxmlformats.org/drawingml/2006/main" noChangeAspect="1"/>
             </wp:cNvGraphicFramePr>
@@ -7269,7 +7375,7 @@
               <a:graphicData uri="http://schemas.openxmlformats.org/drawingml/2006/picture">
                 <pic:pic xmlns:pic="http://schemas.openxmlformats.org/drawingml/2006/picture">
                   <pic:nvPicPr>
-                    <pic:cNvPr id="1285638140" name="Picture 1285638140"/>
+                    <pic:cNvPr id="1514244291" name="Picture 1514244291"/>
                     <pic:cNvPicPr/>
                   </pic:nvPicPr>
                   <pic:blipFill>
@@ -7287,7 +7393,7 @@
                   <pic:spPr>
                     <a:xfrm>
                       <a:off x="0" y="0"/>
-                      <a:ext cx="5400000" cy="2458656"/>
+                      <a:ext cx="5040000" cy="2464684"/>
                     </a:xfrm>
                     <a:prstGeom prst="rect">
                       <a:avLst/>
@@ -7375,41 +7481,95 @@
           <w:sz w:val="24"/>
           <w:szCs w:val="24"/>
         </w:rPr>
-        <w:t>• Cancelar: Permite cancelar el proceso y redirige al usuario a la pantalla principal sin realizar ningún cambio en los datos ni en la tabla de peticiones.</w:t>
-      </w:r>
-    </w:p>
-    <w:p>
-      <w:pPr>
-        <w:rPr>
-          <w:rFonts w:ascii="Arial" w:hAnsi="Arial" w:cs="Arial"/>
-          <w:sz w:val="24"/>
-          <w:szCs w:val="24"/>
-        </w:rPr>
-      </w:pPr>
-      <w:r>
-        <w:rPr>
-          <w:rFonts w:ascii="Arial" w:hAnsi="Arial" w:cs="Arial"/>
-          <w:sz w:val="24"/>
-          <w:szCs w:val="24"/>
-        </w:rPr>
-        <w:t>• Devolver: Retorna la petición al usuario que la capturó en caso de que contenga errores, para su corrección.</w:t>
-      </w:r>
-    </w:p>
-    <w:p>
-      <w:pPr>
-        <w:rPr>
-          <w:rFonts w:ascii="Arial" w:hAnsi="Arial" w:cs="Arial"/>
-          <w:sz w:val="24"/>
-          <w:szCs w:val="24"/>
-        </w:rPr>
-      </w:pPr>
-      <w:r>
-        <w:rPr>
-          <w:rFonts w:ascii="Arial" w:hAnsi="Arial" w:cs="Arial"/>
-          <w:sz w:val="24"/>
-          <w:szCs w:val="24"/>
-        </w:rPr>
-        <w:t xml:space="preserve">• Publicar: Guarda los cambios, actualiza el estatus de la petición y se publican los </w:t>
+        <w:t xml:space="preserve">• </w:t>
+      </w:r>
+      <w:r>
+        <w:rPr>
+          <w:rFonts w:ascii="Arial" w:hAnsi="Arial" w:cs="Arial"/>
+          <w:b/>
+          <w:bCs/>
+          <w:sz w:val="24"/>
+          <w:szCs w:val="24"/>
+        </w:rPr>
+        <w:t>Cancelar</w:t>
+      </w:r>
+      <w:r>
+        <w:rPr>
+          <w:rFonts w:ascii="Arial" w:hAnsi="Arial" w:cs="Arial"/>
+          <w:sz w:val="24"/>
+          <w:szCs w:val="24"/>
+        </w:rPr>
+        <w:t>: Permite cancelar el proceso y redirige al usuario a la pantalla principal sin realizar ningún cambio en los datos ni en la tabla de peticiones.</w:t>
+      </w:r>
+    </w:p>
+    <w:p>
+      <w:pPr>
+        <w:rPr>
+          <w:rFonts w:ascii="Arial" w:hAnsi="Arial" w:cs="Arial"/>
+          <w:sz w:val="24"/>
+          <w:szCs w:val="24"/>
+        </w:rPr>
+      </w:pPr>
+      <w:r>
+        <w:rPr>
+          <w:rFonts w:ascii="Arial" w:hAnsi="Arial" w:cs="Arial"/>
+          <w:sz w:val="24"/>
+          <w:szCs w:val="24"/>
+        </w:rPr>
+        <w:t xml:space="preserve">• </w:t>
+      </w:r>
+      <w:r>
+        <w:rPr>
+          <w:rFonts w:ascii="Arial" w:hAnsi="Arial" w:cs="Arial"/>
+          <w:b/>
+          <w:bCs/>
+          <w:sz w:val="24"/>
+          <w:szCs w:val="24"/>
+        </w:rPr>
+        <w:t>Devolver</w:t>
+      </w:r>
+      <w:r>
+        <w:rPr>
+          <w:rFonts w:ascii="Arial" w:hAnsi="Arial" w:cs="Arial"/>
+          <w:sz w:val="24"/>
+          <w:szCs w:val="24"/>
+        </w:rPr>
+        <w:t>: Retorna la petición al usuario que la capturó en caso de que contenga errores, para su corrección.</w:t>
+      </w:r>
+    </w:p>
+    <w:p>
+      <w:pPr>
+        <w:rPr>
+          <w:rFonts w:ascii="Arial" w:hAnsi="Arial" w:cs="Arial"/>
+          <w:sz w:val="24"/>
+          <w:szCs w:val="24"/>
+        </w:rPr>
+      </w:pPr>
+      <w:r>
+        <w:rPr>
+          <w:rFonts w:ascii="Arial" w:hAnsi="Arial" w:cs="Arial"/>
+          <w:sz w:val="24"/>
+          <w:szCs w:val="24"/>
+        </w:rPr>
+        <w:t xml:space="preserve">• </w:t>
+      </w:r>
+      <w:r>
+        <w:rPr>
+          <w:rFonts w:ascii="Arial" w:hAnsi="Arial" w:cs="Arial"/>
+          <w:b/>
+          <w:bCs/>
+          <w:sz w:val="24"/>
+          <w:szCs w:val="24"/>
+        </w:rPr>
+        <w:t>Publicar</w:t>
+      </w:r>
+      <w:r>
+        <w:rPr>
+          <w:rFonts w:ascii="Arial" w:hAnsi="Arial" w:cs="Arial"/>
+          <w:sz w:val="24"/>
+          <w:szCs w:val="24"/>
+        </w:rPr>
+        <w:t xml:space="preserve">: Guarda los cambios, actualiza el estatus de la petición y se publican los </w:t>
       </w:r>
       <w:r>
         <w:rPr>
@@ -7575,7 +7735,7 @@
           <w:szCs w:val="24"/>
         </w:rPr>
         <w:drawing>
-          <wp:inline distT="0" distB="0" distL="0" distR="0" wp14:anchorId="1C8804CF" wp14:editId="50EE2CFD">
+          <wp:inline distT="0" distB="0" distL="0" distR="0" wp14:anchorId="1C8804CF" wp14:editId="4BA06DB4">
             <wp:extent cx="5612130" cy="2208530"/>
             <wp:effectExtent l="152400" t="152400" r="344170" b="344170"/>
             <wp:docPr id="2101952696" name="Picture 9"/>
@@ -7590,7 +7750,7 @@
                     <pic:cNvPicPr/>
                   </pic:nvPicPr>
                   <pic:blipFill>
-                    <a:blip r:embed="rId16" cstate="print">
+                    <a:blip r:embed="rId17" cstate="print">
                       <a:extLst>
                         <a:ext uri="{28A0092B-C50C-407E-A947-70E740481C1C}">
                           <a14:useLocalDpi xmlns:a14="http://schemas.microsoft.com/office/drawing/2010/main" val="0"/>
@@ -7652,21 +7812,669 @@
           <w:color w:val="auto"/>
         </w:rPr>
       </w:pPr>
-      <w:bookmarkStart w:id="20" w:name="_Toc123565165"/>
-      <w:bookmarkStart w:id="21" w:name="_Toc124341673"/>
-      <w:bookmarkStart w:id="22" w:name="_Toc199150456"/>
-      <w:r>
+      <w:bookmarkStart w:id="20" w:name="_Toc211942413"/>
+      <w:bookmarkStart w:id="21" w:name="_Toc213340177"/>
+      <w:bookmarkStart w:id="22" w:name="_Toc123565165"/>
+      <w:bookmarkStart w:id="23" w:name="_Toc124341673"/>
+    </w:p>
+    <w:p>
+      <w:pPr>
+        <w:pStyle w:val="Heading1"/>
+        <w:spacing w:line="276" w:lineRule="auto"/>
+        <w:jc w:val="center"/>
         <w:rPr>
           <w:rFonts w:cs="Arial"/>
           <w:b w:val="0"/>
           <w:color w:val="auto"/>
         </w:rPr>
-        <w:lastRenderedPageBreak/>
-        <w:t>5.- Consulta de estatus</w:t>
+      </w:pPr>
+      <w:bookmarkStart w:id="24" w:name="_Toc214010218"/>
+      <w:r>
+        <w:rPr>
+          <w:rFonts w:cs="Arial"/>
+          <w:b w:val="0"/>
+          <w:color w:val="auto"/>
+        </w:rPr>
+        <w:t>5</w:t>
+      </w:r>
+      <w:r>
+        <w:rPr>
+          <w:rFonts w:cs="Arial"/>
+          <w:b w:val="0"/>
+          <w:color w:val="auto"/>
+        </w:rPr>
+        <w:t xml:space="preserve">.- </w:t>
+      </w:r>
+      <w:r>
+        <w:rPr>
+          <w:rFonts w:cs="Arial"/>
+          <w:b w:val="0"/>
+          <w:color w:val="auto"/>
+        </w:rPr>
+        <w:t>Para eliminar los datos registrados</w:t>
       </w:r>
       <w:bookmarkEnd w:id="20"/>
+      <w:r>
+        <w:rPr>
+          <w:rFonts w:cs="Arial"/>
+          <w:b w:val="0"/>
+          <w:color w:val="auto"/>
+        </w:rPr>
+        <w:t xml:space="preserve"> </w:t>
+      </w:r>
+      <w:r>
+        <w:rPr>
+          <w:rFonts w:cs="Arial"/>
+          <w:b w:val="0"/>
+          <w:color w:val="auto"/>
+        </w:rPr>
+        <w:t xml:space="preserve">de Participaciones Federales </w:t>
+      </w:r>
+      <w:r>
+        <w:rPr>
+          <w:rFonts w:cs="Arial"/>
+          <w:b w:val="0"/>
+          <w:color w:val="auto"/>
+        </w:rPr>
+        <w:t>–</w:t>
+      </w:r>
+      <w:r>
+        <w:rPr>
+          <w:rFonts w:cs="Arial"/>
+          <w:b w:val="0"/>
+          <w:color w:val="auto"/>
+        </w:rPr>
+        <w:t xml:space="preserve"> </w:t>
+      </w:r>
       <w:bookmarkEnd w:id="21"/>
+      <w:r>
+        <w:rPr>
+          <w:rFonts w:cs="Arial"/>
+          <w:b w:val="0"/>
+          <w:color w:val="auto"/>
+        </w:rPr>
+        <w:t>Memorias de Cálculos</w:t>
+      </w:r>
+      <w:bookmarkEnd w:id="24"/>
+    </w:p>
+    <w:p>
+      <w:pPr>
+        <w:rPr>
+          <w:rFonts w:ascii="Arial" w:hAnsi="Arial" w:cs="Arial"/>
+          <w:sz w:val="24"/>
+          <w:szCs w:val="24"/>
+        </w:rPr>
+      </w:pPr>
+    </w:p>
+    <w:p>
+      <w:pPr>
+        <w:rPr>
+          <w:rFonts w:ascii="Arial" w:hAnsi="Arial" w:cs="Arial"/>
+          <w:sz w:val="24"/>
+          <w:szCs w:val="24"/>
+        </w:rPr>
+      </w:pPr>
+      <w:r>
+        <w:rPr>
+          <w:rFonts w:ascii="Arial" w:hAnsi="Arial" w:cs="Arial"/>
+          <w:sz w:val="24"/>
+          <w:szCs w:val="24"/>
+        </w:rPr>
+        <w:t>5</w:t>
+      </w:r>
+      <w:r>
+        <w:rPr>
+          <w:rFonts w:ascii="Arial" w:hAnsi="Arial" w:cs="Arial"/>
+          <w:sz w:val="24"/>
+          <w:szCs w:val="24"/>
+        </w:rPr>
+        <w:t xml:space="preserve">.1.- Para </w:t>
+      </w:r>
+      <w:r>
+        <w:rPr>
+          <w:rFonts w:ascii="Arial" w:hAnsi="Arial" w:cs="Arial"/>
+          <w:sz w:val="24"/>
+          <w:szCs w:val="24"/>
+        </w:rPr>
+        <w:t>eliminar</w:t>
+      </w:r>
+      <w:r>
+        <w:rPr>
+          <w:rFonts w:ascii="Arial" w:hAnsi="Arial" w:cs="Arial"/>
+          <w:sz w:val="24"/>
+          <w:szCs w:val="24"/>
+        </w:rPr>
+        <w:t xml:space="preserve"> los detalles de</w:t>
+      </w:r>
+      <w:r>
+        <w:rPr>
+          <w:rFonts w:ascii="Arial" w:hAnsi="Arial" w:cs="Arial"/>
+          <w:sz w:val="24"/>
+          <w:szCs w:val="24"/>
+        </w:rPr>
+        <w:t xml:space="preserve"> </w:t>
+      </w:r>
+      <w:r>
+        <w:rPr>
+          <w:rFonts w:ascii="Arial" w:hAnsi="Arial" w:cs="Arial"/>
+          <w:sz w:val="24"/>
+          <w:szCs w:val="24"/>
+        </w:rPr>
+        <w:t>l</w:t>
+      </w:r>
+      <w:r>
+        <w:rPr>
+          <w:rFonts w:ascii="Arial" w:hAnsi="Arial" w:cs="Arial"/>
+          <w:sz w:val="24"/>
+          <w:szCs w:val="24"/>
+        </w:rPr>
+        <w:t>a</w:t>
+      </w:r>
+      <w:r>
+        <w:rPr>
+          <w:rFonts w:ascii="Arial" w:hAnsi="Arial" w:cs="Arial"/>
+          <w:sz w:val="24"/>
+          <w:szCs w:val="24"/>
+        </w:rPr>
+        <w:t xml:space="preserve"> </w:t>
+      </w:r>
+      <w:r>
+        <w:rPr>
+          <w:rFonts w:ascii="Arial" w:hAnsi="Arial" w:cs="Arial"/>
+          <w:sz w:val="24"/>
+          <w:szCs w:val="24"/>
+        </w:rPr>
+        <w:t xml:space="preserve">información de Participaciones Federales – Memorias de Cálculos deberá seleccionar el icono de Eliminar   </w:t>
+      </w:r>
+      <w:r>
+        <w:rPr>
+          <w:rFonts w:ascii="Arial" w:hAnsi="Arial" w:cs="Arial"/>
+          <w:noProof/>
+          <w:sz w:val="24"/>
+          <w:szCs w:val="24"/>
+        </w:rPr>
+        <w:drawing>
+          <wp:inline distT="0" distB="0" distL="0" distR="0" wp14:anchorId="07F678FC" wp14:editId="158C0CC7">
+            <wp:extent cx="180000" cy="212000"/>
+            <wp:effectExtent l="0" t="0" r="0" b="4445"/>
+            <wp:docPr id="39704351" name="Picture 2"/>
+            <wp:cNvGraphicFramePr>
+              <a:graphicFrameLocks xmlns:a="http://schemas.openxmlformats.org/drawingml/2006/main" noChangeAspect="1"/>
+            </wp:cNvGraphicFramePr>
+            <a:graphic xmlns:a="http://schemas.openxmlformats.org/drawingml/2006/main">
+              <a:graphicData uri="http://schemas.openxmlformats.org/drawingml/2006/picture">
+                <pic:pic xmlns:pic="http://schemas.openxmlformats.org/drawingml/2006/picture">
+                  <pic:nvPicPr>
+                    <pic:cNvPr id="39704351" name="Picture 39704351"/>
+                    <pic:cNvPicPr/>
+                  </pic:nvPicPr>
+                  <pic:blipFill>
+                    <a:blip r:embed="rId18" cstate="print">
+                      <a:extLst>
+                        <a:ext uri="{28A0092B-C50C-407E-A947-70E740481C1C}">
+                          <a14:useLocalDpi xmlns:a14="http://schemas.microsoft.com/office/drawing/2010/main" val="0"/>
+                        </a:ext>
+                      </a:extLst>
+                    </a:blip>
+                    <a:stretch>
+                      <a:fillRect/>
+                    </a:stretch>
+                  </pic:blipFill>
+                  <pic:spPr>
+                    <a:xfrm>
+                      <a:off x="0" y="0"/>
+                      <a:ext cx="180000" cy="212000"/>
+                    </a:xfrm>
+                    <a:prstGeom prst="rect">
+                      <a:avLst/>
+                    </a:prstGeom>
+                  </pic:spPr>
+                </pic:pic>
+              </a:graphicData>
+            </a:graphic>
+          </wp:inline>
+        </w:drawing>
+      </w:r>
+    </w:p>
+    <w:p>
+      <w:pPr>
+        <w:spacing w:line="276" w:lineRule="auto"/>
+        <w:rPr>
+          <w:rFonts w:ascii="Arial" w:hAnsi="Arial" w:cs="Arial"/>
+          <w:sz w:val="24"/>
+          <w:szCs w:val="24"/>
+        </w:rPr>
+      </w:pPr>
+    </w:p>
+    <w:p>
+      <w:pPr>
+        <w:spacing w:line="276" w:lineRule="auto"/>
+        <w:rPr>
+          <w:rFonts w:ascii="Arial" w:hAnsi="Arial" w:cs="Arial"/>
+          <w:sz w:val="24"/>
+          <w:szCs w:val="24"/>
+        </w:rPr>
+      </w:pPr>
+      <w:r>
+        <w:rPr>
+          <w:noProof/>
+          <w:lang w:val="es-MX" w:eastAsia="es-MX"/>
+        </w:rPr>
+        <mc:AlternateContent>
+          <mc:Choice Requires="wps">
+            <w:drawing>
+              <wp:anchor distT="0" distB="0" distL="114300" distR="114300" simplePos="0" relativeHeight="251867136" behindDoc="0" locked="0" layoutInCell="1" allowOverlap="1" wp14:anchorId="38D2EEBB" wp14:editId="509845D8">
+                <wp:simplePos x="0" y="0"/>
+                <wp:positionH relativeFrom="column">
+                  <wp:posOffset>261126</wp:posOffset>
+                </wp:positionH>
+                <wp:positionV relativeFrom="paragraph">
+                  <wp:posOffset>857744</wp:posOffset>
+                </wp:positionV>
+                <wp:extent cx="132368" cy="140220"/>
+                <wp:effectExtent l="12700" t="12700" r="7620" b="12700"/>
+                <wp:wrapNone/>
+                <wp:docPr id="244479765" name="Rectángulo 36"/>
+                <wp:cNvGraphicFramePr/>
+                <a:graphic xmlns:a="http://schemas.openxmlformats.org/drawingml/2006/main">
+                  <a:graphicData uri="http://schemas.microsoft.com/office/word/2010/wordprocessingShape">
+                    <wps:wsp>
+                      <wps:cNvSpPr/>
+                      <wps:spPr>
+                        <a:xfrm>
+                          <a:off x="0" y="0"/>
+                          <a:ext cx="132368" cy="140220"/>
+                        </a:xfrm>
+                        <a:prstGeom prst="rect">
+                          <a:avLst/>
+                        </a:prstGeom>
+                        <a:noFill/>
+                        <a:ln w="22225">
+                          <a:solidFill>
+                            <a:srgbClr val="FF0000"/>
+                          </a:solidFill>
+                        </a:ln>
+                      </wps:spPr>
+                      <wps:style>
+                        <a:lnRef idx="2">
+                          <a:schemeClr val="accent1">
+                            <a:shade val="50000"/>
+                          </a:schemeClr>
+                        </a:lnRef>
+                        <a:fillRef idx="1">
+                          <a:schemeClr val="accent1"/>
+                        </a:fillRef>
+                        <a:effectRef idx="0">
+                          <a:schemeClr val="accent1"/>
+                        </a:effectRef>
+                        <a:fontRef idx="minor">
+                          <a:schemeClr val="lt1"/>
+                        </a:fontRef>
+                      </wps:style>
+                      <wps:bodyPr rot="0" spcFirstLastPara="0" vertOverflow="overflow" horzOverflow="overflow" vert="horz" wrap="square" lIns="91440" tIns="45720" rIns="91440" bIns="45720" numCol="1" spcCol="0" rtlCol="0" fromWordArt="0" anchor="ctr" anchorCtr="0" forceAA="0" compatLnSpc="1">
+                        <a:prstTxWarp prst="textNoShape">
+                          <a:avLst/>
+                        </a:prstTxWarp>
+                        <a:noAutofit/>
+                      </wps:bodyPr>
+                    </wps:wsp>
+                  </a:graphicData>
+                </a:graphic>
+                <wp14:sizeRelH relativeFrom="margin">
+                  <wp14:pctWidth>0</wp14:pctWidth>
+                </wp14:sizeRelH>
+                <wp14:sizeRelV relativeFrom="margin">
+                  <wp14:pctHeight>0</wp14:pctHeight>
+                </wp14:sizeRelV>
+              </wp:anchor>
+            </w:drawing>
+          </mc:Choice>
+          <mc:Fallback>
+            <w:pict>
+              <v:rect w14:anchorId="63A85906" id="Rectángulo 36" o:spid="_x0000_s1026" style="position:absolute;margin-left:20.55pt;margin-top:67.55pt;width:10.4pt;height:11.05pt;z-index:251867136;visibility:visible;mso-wrap-style:square;mso-width-percent:0;mso-height-percent:0;mso-wrap-distance-left:9pt;mso-wrap-distance-top:0;mso-wrap-distance-right:9pt;mso-wrap-distance-bottom:0;mso-position-horizontal:absolute;mso-position-horizontal-relative:text;mso-position-vertical:absolute;mso-position-vertical-relative:text;mso-width-percent:0;mso-height-percent:0;mso-width-relative:margin;mso-height-relative:margin;v-text-anchor:middle" o:gfxdata="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" filled="f" strokecolor="red" strokeweight="1.75pt"/>
+            </w:pict>
+          </mc:Fallback>
+        </mc:AlternateContent>
+      </w:r>
+      <w:r>
+        <w:rPr>
+          <w:rFonts w:ascii="Arial" w:hAnsi="Arial" w:cs="Arial"/>
+          <w:noProof/>
+          <w:lang w:val="es-MX" w:eastAsia="es-MX"/>
+        </w:rPr>
+        <w:drawing>
+          <wp:inline distT="0" distB="0" distL="0" distR="0" wp14:anchorId="614AC7C2" wp14:editId="4500D2B6">
+            <wp:extent cx="5040000" cy="2464684"/>
+            <wp:effectExtent l="152400" t="152400" r="332105" b="342265"/>
+            <wp:docPr id="1984096577" name="Picture 1"/>
+            <wp:cNvGraphicFramePr>
+              <a:graphicFrameLocks xmlns:a="http://schemas.openxmlformats.org/drawingml/2006/main" noChangeAspect="1"/>
+            </wp:cNvGraphicFramePr>
+            <a:graphic xmlns:a="http://schemas.openxmlformats.org/drawingml/2006/main">
+              <a:graphicData uri="http://schemas.openxmlformats.org/drawingml/2006/picture">
+                <pic:pic xmlns:pic="http://schemas.openxmlformats.org/drawingml/2006/picture">
+                  <pic:nvPicPr>
+                    <pic:cNvPr id="1514244291" name="Picture 1514244291"/>
+                    <pic:cNvPicPr/>
+                  </pic:nvPicPr>
+                  <pic:blipFill>
+                    <a:blip r:embed="rId11" cstate="print">
+                      <a:extLst>
+                        <a:ext uri="{28A0092B-C50C-407E-A947-70E740481C1C}">
+                          <a14:useLocalDpi xmlns:a14="http://schemas.microsoft.com/office/drawing/2010/main" val="0"/>
+                        </a:ext>
+                      </a:extLst>
+                    </a:blip>
+                    <a:stretch>
+                      <a:fillRect/>
+                    </a:stretch>
+                  </pic:blipFill>
+                  <pic:spPr>
+                    <a:xfrm>
+                      <a:off x="0" y="0"/>
+                      <a:ext cx="5040000" cy="2464684"/>
+                    </a:xfrm>
+                    <a:prstGeom prst="rect">
+                      <a:avLst/>
+                    </a:prstGeom>
+                    <a:effectLst>
+                      <a:outerShdw blurRad="292100" dist="139700" dir="2700000" algn="ctr" rotWithShape="0">
+                        <a:srgbClr val="000000">
+                          <a:alpha val="65000"/>
+                        </a:srgbClr>
+                      </a:outerShdw>
+                    </a:effectLst>
+                  </pic:spPr>
+                </pic:pic>
+              </a:graphicData>
+            </a:graphic>
+          </wp:inline>
+        </w:drawing>
+      </w:r>
+    </w:p>
+    <w:p>
+      <w:pPr>
+        <w:spacing w:line="276" w:lineRule="auto"/>
+        <w:rPr>
+          <w:rFonts w:ascii="Arial" w:hAnsi="Arial" w:cs="Arial"/>
+          <w:sz w:val="24"/>
+          <w:szCs w:val="24"/>
+        </w:rPr>
+      </w:pPr>
+    </w:p>
+    <w:p>
+      <w:pPr>
+        <w:rPr>
+          <w:rFonts w:ascii="Arial" w:hAnsi="Arial" w:cs="Arial"/>
+          <w:sz w:val="24"/>
+          <w:szCs w:val="24"/>
+        </w:rPr>
+      </w:pPr>
+      <w:r>
+        <w:rPr>
+          <w:rFonts w:ascii="Arial" w:hAnsi="Arial" w:cs="Arial"/>
+          <w:sz w:val="24"/>
+          <w:szCs w:val="24"/>
+        </w:rPr>
+        <w:br w:type="page"/>
+      </w:r>
+    </w:p>
+    <w:p>
+      <w:pPr>
+        <w:spacing w:line="276" w:lineRule="auto"/>
+        <w:rPr>
+          <w:rFonts w:ascii="Arial" w:hAnsi="Arial" w:cs="Arial"/>
+          <w:sz w:val="24"/>
+          <w:szCs w:val="24"/>
+        </w:rPr>
+      </w:pPr>
+    </w:p>
+    <w:p>
+      <w:pPr>
+        <w:spacing w:line="276" w:lineRule="auto"/>
+        <w:rPr>
+          <w:rFonts w:ascii="Arial" w:hAnsi="Arial" w:cs="Arial"/>
+          <w:sz w:val="24"/>
+          <w:szCs w:val="24"/>
+        </w:rPr>
+      </w:pPr>
+      <w:r>
+        <w:rPr>
+          <w:rFonts w:ascii="Arial" w:hAnsi="Arial" w:cs="Arial"/>
+          <w:sz w:val="24"/>
+          <w:szCs w:val="24"/>
+        </w:rPr>
+        <w:t>Y deberá confirmar el proceso de Eliminación de un registro de las Participaciones Federales - Memorias de Cálculos.</w:t>
+      </w:r>
+    </w:p>
+    <w:p>
+      <w:pPr>
+        <w:spacing w:line="276" w:lineRule="auto"/>
+        <w:rPr>
+          <w:rFonts w:ascii="Arial" w:hAnsi="Arial" w:cs="Arial"/>
+          <w:sz w:val="24"/>
+          <w:szCs w:val="24"/>
+        </w:rPr>
+      </w:pPr>
+    </w:p>
+    <w:p>
+      <w:pPr>
+        <w:spacing w:line="276" w:lineRule="auto"/>
+        <w:jc w:val="center"/>
+        <w:rPr>
+          <w:rFonts w:ascii="Arial" w:hAnsi="Arial" w:cs="Arial"/>
+          <w:sz w:val="24"/>
+          <w:szCs w:val="24"/>
+        </w:rPr>
+      </w:pPr>
+      <w:r>
+        <w:rPr>
+          <w:noProof/>
+          <w:lang w:val="es-MX" w:eastAsia="es-MX"/>
+        </w:rPr>
+        <mc:AlternateContent>
+          <mc:Choice Requires="wps">
+            <w:drawing>
+              <wp:anchor distT="0" distB="0" distL="114300" distR="114300" simplePos="0" relativeHeight="251869184" behindDoc="0" locked="0" layoutInCell="1" allowOverlap="1" wp14:anchorId="2370DDC7" wp14:editId="3BF8D12B">
+                <wp:simplePos x="0" y="0"/>
+                <wp:positionH relativeFrom="margin">
+                  <wp:posOffset>1848031</wp:posOffset>
+                </wp:positionH>
+                <wp:positionV relativeFrom="paragraph">
+                  <wp:posOffset>2287270</wp:posOffset>
+                </wp:positionV>
+                <wp:extent cx="900000" cy="396000"/>
+                <wp:effectExtent l="12700" t="12700" r="27305" b="23495"/>
+                <wp:wrapNone/>
+                <wp:docPr id="1557520684" name="Rectángulo 34"/>
+                <wp:cNvGraphicFramePr/>
+                <a:graphic xmlns:a="http://schemas.openxmlformats.org/drawingml/2006/main">
+                  <a:graphicData uri="http://schemas.microsoft.com/office/word/2010/wordprocessingShape">
+                    <wps:wsp>
+                      <wps:cNvSpPr/>
+                      <wps:spPr>
+                        <a:xfrm>
+                          <a:off x="0" y="0"/>
+                          <a:ext cx="900000" cy="396000"/>
+                        </a:xfrm>
+                        <a:prstGeom prst="rect">
+                          <a:avLst/>
+                        </a:prstGeom>
+                        <a:noFill/>
+                        <a:ln w="38100">
+                          <a:solidFill>
+                            <a:srgbClr val="FF0000"/>
+                          </a:solidFill>
+                        </a:ln>
+                      </wps:spPr>
+                      <wps:style>
+                        <a:lnRef idx="2">
+                          <a:schemeClr val="accent1">
+                            <a:shade val="50000"/>
+                          </a:schemeClr>
+                        </a:lnRef>
+                        <a:fillRef idx="1">
+                          <a:schemeClr val="accent1"/>
+                        </a:fillRef>
+                        <a:effectRef idx="0">
+                          <a:schemeClr val="accent1"/>
+                        </a:effectRef>
+                        <a:fontRef idx="minor">
+                          <a:schemeClr val="lt1"/>
+                        </a:fontRef>
+                      </wps:style>
+                      <wps:bodyPr rot="0" spcFirstLastPara="0" vertOverflow="overflow" horzOverflow="overflow" vert="horz" wrap="square" lIns="91440" tIns="45720" rIns="91440" bIns="45720" numCol="1" spcCol="0" rtlCol="0" fromWordArt="0" anchor="ctr" anchorCtr="0" forceAA="0" compatLnSpc="1">
+                        <a:prstTxWarp prst="textNoShape">
+                          <a:avLst/>
+                        </a:prstTxWarp>
+                        <a:noAutofit/>
+                      </wps:bodyPr>
+                    </wps:wsp>
+                  </a:graphicData>
+                </a:graphic>
+                <wp14:sizeRelH relativeFrom="margin">
+                  <wp14:pctWidth>0</wp14:pctWidth>
+                </wp14:sizeRelH>
+                <wp14:sizeRelV relativeFrom="margin">
+                  <wp14:pctHeight>0</wp14:pctHeight>
+                </wp14:sizeRelV>
+              </wp:anchor>
+            </w:drawing>
+          </mc:Choice>
+          <mc:Fallback>
+            <w:pict>
+              <v:rect w14:anchorId="5D93C69A" id="Rectángulo 34" o:spid="_x0000_s1026" style="position:absolute;margin-left:145.5pt;margin-top:180.1pt;width:70.85pt;height:31.2pt;z-index:251869184;visibility:visible;mso-wrap-style:square;mso-width-percent:0;mso-height-percent:0;mso-wrap-distance-left:9pt;mso-wrap-distance-top:0;mso-wrap-distance-right:9pt;mso-wrap-distance-bottom:0;mso-position-horizontal:absolute;mso-position-horizontal-relative:margin;mso-position-vertical:absolute;mso-position-vertical-relative:text;mso-width-percent:0;mso-height-percent:0;mso-width-relative:margin;mso-height-relative:margin;v-text-anchor:middle" o:gfxdata="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" filled="f" strokecolor="red" strokeweight="3pt">
+                <w10:wrap anchorx="margin"/>
+              </v:rect>
+            </w:pict>
+          </mc:Fallback>
+        </mc:AlternateContent>
+      </w:r>
+      <w:r>
+        <w:rPr>
+          <w:noProof/>
+          <w:lang w:val="es-MX" w:eastAsia="es-MX"/>
+        </w:rPr>
+        <w:drawing>
+          <wp:inline distT="0" distB="0" distL="0" distR="0" wp14:anchorId="537D2919" wp14:editId="039E930E">
+            <wp:extent cx="3822700" cy="2679700"/>
+            <wp:effectExtent l="152400" t="152400" r="330200" b="342900"/>
+            <wp:docPr id="521804190" name="Picture 1"/>
+            <wp:cNvGraphicFramePr>
+              <a:graphicFrameLocks xmlns:a="http://schemas.openxmlformats.org/drawingml/2006/main" noChangeAspect="1"/>
+            </wp:cNvGraphicFramePr>
+            <a:graphic xmlns:a="http://schemas.openxmlformats.org/drawingml/2006/main">
+              <a:graphicData uri="http://schemas.openxmlformats.org/drawingml/2006/picture">
+                <pic:pic xmlns:pic="http://schemas.openxmlformats.org/drawingml/2006/picture">
+                  <pic:nvPicPr>
+                    <pic:cNvPr id="521804190" name="Picture 521804190"/>
+                    <pic:cNvPicPr/>
+                  </pic:nvPicPr>
+                  <pic:blipFill>
+                    <a:blip r:embed="rId19">
+                      <a:extLst>
+                        <a:ext uri="{28A0092B-C50C-407E-A947-70E740481C1C}">
+                          <a14:useLocalDpi xmlns:a14="http://schemas.microsoft.com/office/drawing/2010/main" val="0"/>
+                        </a:ext>
+                      </a:extLst>
+                    </a:blip>
+                    <a:stretch>
+                      <a:fillRect/>
+                    </a:stretch>
+                  </pic:blipFill>
+                  <pic:spPr>
+                    <a:xfrm>
+                      <a:off x="0" y="0"/>
+                      <a:ext cx="3822700" cy="2679700"/>
+                    </a:xfrm>
+                    <a:prstGeom prst="rect">
+                      <a:avLst/>
+                    </a:prstGeom>
+                    <a:effectLst>
+                      <a:outerShdw blurRad="292100" dist="139700" dir="2700000" algn="ctr" rotWithShape="0">
+                        <a:srgbClr val="000000">
+                          <a:alpha val="65000"/>
+                        </a:srgbClr>
+                      </a:outerShdw>
+                    </a:effectLst>
+                  </pic:spPr>
+                </pic:pic>
+              </a:graphicData>
+            </a:graphic>
+          </wp:inline>
+        </w:drawing>
+      </w:r>
+    </w:p>
+    <w:p>
+      <w:pPr>
+        <w:spacing w:line="276" w:lineRule="auto"/>
+        <w:rPr>
+          <w:rFonts w:ascii="Arial" w:hAnsi="Arial" w:cs="Arial"/>
+          <w:sz w:val="24"/>
+          <w:szCs w:val="24"/>
+        </w:rPr>
+      </w:pPr>
+    </w:p>
+    <w:p>
+      <w:pPr>
+        <w:rPr>
+          <w:rFonts w:ascii="Arial" w:hAnsi="Arial" w:cs="Arial"/>
+          <w:sz w:val="24"/>
+          <w:szCs w:val="24"/>
+        </w:rPr>
+      </w:pPr>
+      <w:r>
+        <w:rPr>
+          <w:rFonts w:ascii="Arial" w:hAnsi="Arial" w:cs="Arial"/>
+          <w:sz w:val="24"/>
+          <w:szCs w:val="24"/>
+        </w:rPr>
+        <w:br w:type="page"/>
+      </w:r>
+    </w:p>
+    <w:p>
+      <w:pPr>
+        <w:pStyle w:val="Heading1"/>
+        <w:spacing w:line="276" w:lineRule="auto"/>
+        <w:jc w:val="center"/>
+        <w:rPr>
+          <w:rFonts w:cs="Arial"/>
+          <w:b w:val="0"/>
+          <w:color w:val="auto"/>
+        </w:rPr>
+      </w:pPr>
+    </w:p>
+    <w:p>
+      <w:pPr>
+        <w:pStyle w:val="Heading1"/>
+        <w:spacing w:line="276" w:lineRule="auto"/>
+        <w:jc w:val="center"/>
+        <w:rPr>
+          <w:rFonts w:cs="Arial"/>
+          <w:b w:val="0"/>
+          <w:color w:val="auto"/>
+        </w:rPr>
+      </w:pPr>
+      <w:bookmarkStart w:id="25" w:name="_Toc214010219"/>
+      <w:r>
+        <w:rPr>
+          <w:rFonts w:cs="Arial"/>
+          <w:b w:val="0"/>
+          <w:color w:val="auto"/>
+        </w:rPr>
+        <w:t>6</w:t>
+      </w:r>
+      <w:r>
+        <w:rPr>
+          <w:rFonts w:cs="Arial"/>
+          <w:b w:val="0"/>
+          <w:color w:val="auto"/>
+        </w:rPr>
+        <w:t>.- Consulta de estatus</w:t>
+      </w:r>
       <w:bookmarkEnd w:id="22"/>
+      <w:bookmarkEnd w:id="23"/>
+      <w:bookmarkEnd w:id="25"/>
     </w:p>
     <w:p/>
     <w:p>
@@ -7684,7 +8492,15 @@
           <w:sz w:val="24"/>
           <w:szCs w:val="24"/>
         </w:rPr>
-        <w:t>5.1.- El estatus actual del cálculo aparece en la columna final “</w:t>
+        <w:t>6</w:t>
+      </w:r>
+      <w:r>
+        <w:rPr>
+          <w:rFonts w:ascii="Arial" w:hAnsi="Arial" w:cs="Arial"/>
+          <w:sz w:val="24"/>
+          <w:szCs w:val="24"/>
+        </w:rPr>
+        <w:t>.1.- El estatus actual del cálculo aparece en la columna final “</w:t>
       </w:r>
       <w:r>
         <w:rPr>
@@ -7758,7 +8574,7 @@
                     <pic:cNvPicPr/>
                   </pic:nvPicPr>
                   <pic:blipFill>
-                    <a:blip r:embed="rId17"/>
+                    <a:blip r:embed="rId20"/>
                     <a:stretch>
                       <a:fillRect/>
                     </a:stretch>
@@ -7883,7 +8699,7 @@
           <w:lang w:val="es-MX" w:eastAsia="es-MX"/>
         </w:rPr>
         <w:drawing>
-          <wp:inline distT="0" distB="0" distL="0" distR="0" wp14:anchorId="0D5408C5" wp14:editId="25C35059">
+          <wp:inline distT="0" distB="0" distL="0" distR="0" wp14:anchorId="0D5408C5" wp14:editId="246154D9">
             <wp:extent cx="5400000" cy="2527088"/>
             <wp:effectExtent l="152400" t="152400" r="340995" b="343535"/>
             <wp:docPr id="182859001" name="Picture 2"/>
@@ -7898,7 +8714,7 @@
                     <pic:cNvPicPr/>
                   </pic:nvPicPr>
                   <pic:blipFill>
-                    <a:blip r:embed="rId18" cstate="print">
+                    <a:blip r:embed="rId21" cstate="print">
                       <a:extLst>
                         <a:ext uri="{28A0092B-C50C-407E-A947-70E740481C1C}">
                           <a14:useLocalDpi xmlns:a14="http://schemas.microsoft.com/office/drawing/2010/main" val="0"/>
@@ -7943,8 +8759,8 @@
       </w:pPr>
     </w:p>
     <w:sectPr>
-      <w:headerReference w:type="default" r:id="rId19"/>
-      <w:footerReference w:type="default" r:id="rId20"/>
+      <w:headerReference w:type="default" r:id="rId22"/>
+      <w:footerReference w:type="default" r:id="rId23"/>
       <w:pgSz w:w="12240" w:h="15840" w:code="1"/>
       <w:pgMar w:top="1417" w:right="1701" w:bottom="1417" w:left="1701" w:header="708" w:footer="708" w:gutter="0"/>
       <w:cols w:space="708"/>
@@ -8447,7 +9263,7 @@
         <v:path o:extrusionok="f" gradientshapeok="t" o:connecttype="rect"/>
         <o:lock v:ext="edit" aspectratio="t"/>
       </v:shapetype>
-      <v:shape id="_x0000_i1067" type="#_x0000_t75" style="width:202.3pt;height:65.85pt;visibility:visible;mso-wrap-style:square" o:bullet="t">
+      <v:shape id="_x0000_i1064" type="#_x0000_t75" style="width:202.1pt;height:65.75pt;visibility:visible;mso-wrap-style:square" o:bullet="t">
         <v:imagedata r:id="rId1" o:title=""/>
       </v:shape>
     </w:pict>

</xml_diff>